<commit_message>
Perbaiki urutan elemen OOXML pada pembuat laporan agar berkas Word terbuka tanpa peringatan
Co-authored-by: arena-agent <297053741+arena-agent@users.noreply.github.com>
</commit_message>
<xml_diff>
--- a/laporan/Laporan_UTS_Perbandingan_Model_Desain_Pembelajaran.docx
+++ b/laporan/Laporan_UTS_Perbandingan_Model_Desain_Pembelajaran.docx
@@ -420,10 +420,10 @@
           <w:footerReference w:type="default" r:id="rId9"/>
           <w:pgSz w:w="11906" w:h="16838"/>
           <w:pgMar w:top="1701" w:right="1701" w:bottom="1701" w:left="2268" w:header="720" w:footer="720" w:gutter="0"/>
+          <w:pgNumType w:fmt="lowerRoman" w:start="1"/>
           <w:cols w:space="720"/>
           <w:titlePg/>
           <w:docGrid w:linePitch="360"/>
-          <w:pgNumType w:fmt="lowerRoman" w:start="1"/>
         </w:sectPr>
       </w:pPr>
     </w:p>
@@ -1509,7 +1509,6 @@
         <w:jc w:val="center"/>
         <w:tblLayout w:type="fixed"/>
         <w:tblLook w:firstColumn="1" w:firstRow="1" w:lastColumn="0" w:lastRow="0" w:noHBand="0" w:noVBand="1" w:val="04A0"/>
-        <w:tblLayout w:type="fixed"/>
       </w:tblPr>
       <w:tblGrid>
         <w:gridCol w:w="1984"/>
@@ -2666,7 +2665,6 @@
         <w:jc w:val="center"/>
         <w:tblLayout w:type="fixed"/>
         <w:tblLook w:firstColumn="1" w:firstRow="1" w:lastColumn="0" w:lastRow="0" w:noHBand="0" w:noVBand="1" w:val="04A0"/>
-        <w:tblLayout w:type="fixed"/>
       </w:tblPr>
       <w:tblGrid>
         <w:gridCol w:w="1984"/>
@@ -4205,7 +4203,6 @@
         <w:jc w:val="center"/>
         <w:tblLayout w:type="fixed"/>
         <w:tblLook w:firstColumn="1" w:firstRow="1" w:lastColumn="0" w:lastRow="0" w:noHBand="0" w:noVBand="1" w:val="04A0"/>
-        <w:tblLayout w:type="fixed"/>
       </w:tblPr>
       <w:tblGrid>
         <w:gridCol w:w="2646"/>
@@ -5221,7 +5218,6 @@
         <w:jc w:val="center"/>
         <w:tblLayout w:type="fixed"/>
         <w:tblLook w:firstColumn="1" w:firstRow="1" w:lastColumn="0" w:lastRow="0" w:noHBand="0" w:noVBand="1" w:val="04A0"/>
-        <w:tblLayout w:type="fixed"/>
       </w:tblPr>
       <w:tblGrid>
         <w:gridCol w:w="2646"/>
@@ -5607,7 +5603,6 @@
         <w:jc w:val="center"/>
         <w:tblLayout w:type="fixed"/>
         <w:tblLook w:firstColumn="1" w:firstRow="1" w:lastColumn="0" w:lastRow="0" w:noHBand="0" w:noVBand="1" w:val="04A0"/>
-        <w:tblLayout w:type="fixed"/>
       </w:tblPr>
       <w:tblGrid>
         <w:gridCol w:w="1984"/>
@@ -7454,7 +7449,6 @@
         <w:jc w:val="center"/>
         <w:tblLayout w:type="fixed"/>
         <w:tblLook w:firstColumn="1" w:firstRow="1" w:lastColumn="0" w:lastRow="0" w:noHBand="0" w:noVBand="1" w:val="04A0"/>
-        <w:tblLayout w:type="fixed"/>
       </w:tblPr>
       <w:tblGrid>
         <w:gridCol w:w="1984"/>
@@ -7929,9 +7923,9 @@
     </w:p>
     <w:p>
       <w:pPr>
+        <w:shd w:val="clear" w:color="auto" w:fill="F2F2F2"/>
         <w:spacing w:line="240" w:lineRule="auto" w:before="80" w:after="200"/>
         <w:ind w:left="340" w:right="227"/>
-        <w:shd w:val="clear" w:color="auto" w:fill="F2F2F2"/>
       </w:pPr>
       <w:r>
         <w:rPr>
@@ -8187,9 +8181,9 @@
     </w:p>
     <w:p>
       <w:pPr>
+        <w:shd w:val="clear" w:color="auto" w:fill="F2F2F2"/>
         <w:spacing w:line="240" w:lineRule="auto" w:before="80" w:after="200"/>
         <w:ind w:left="340" w:right="227"/>
-        <w:shd w:val="clear" w:color="auto" w:fill="F2F2F2"/>
       </w:pPr>
       <w:r>
         <w:rPr>
@@ -8515,9 +8509,9 @@
     </w:p>
     <w:p>
       <w:pPr>
+        <w:shd w:val="clear" w:color="auto" w:fill="F2F2F2"/>
         <w:spacing w:line="240" w:lineRule="auto" w:before="80" w:after="200"/>
         <w:ind w:left="340" w:right="227"/>
-        <w:shd w:val="clear" w:color="auto" w:fill="F2F2F2"/>
       </w:pPr>
       <w:r>
         <w:rPr>
@@ -8987,7 +8981,6 @@
         <w:jc w:val="center"/>
         <w:tblLayout w:type="fixed"/>
         <w:tblLook w:firstColumn="1" w:firstRow="1" w:lastColumn="0" w:lastRow="0" w:noHBand="0" w:noVBand="1" w:val="04A0"/>
-        <w:tblLayout w:type="fixed"/>
       </w:tblPr>
       <w:tblGrid>
         <w:gridCol w:w="2646"/>
@@ -9351,9 +9344,9 @@
     </w:p>
     <w:p>
       <w:pPr>
+        <w:shd w:val="clear" w:color="auto" w:fill="F2F2F2"/>
         <w:spacing w:line="240" w:lineRule="auto" w:before="80" w:after="200"/>
         <w:ind w:left="340" w:right="227"/>
-        <w:shd w:val="clear" w:color="auto" w:fill="F2F2F2"/>
       </w:pPr>
       <w:r>
         <w:rPr>
@@ -9915,7 +9908,6 @@
         <w:jc w:val="center"/>
         <w:tblLayout w:type="fixed"/>
         <w:tblLook w:firstColumn="1" w:firstRow="1" w:lastColumn="0" w:lastRow="0" w:noHBand="0" w:noVBand="1" w:val="04A0"/>
-        <w:tblLayout w:type="fixed"/>
       </w:tblPr>
       <w:tblGrid>
         <w:gridCol w:w="2646"/>
@@ -10903,7 +10895,6 @@
         <w:jc w:val="center"/>
         <w:tblLayout w:type="fixed"/>
         <w:tblLook w:firstColumn="1" w:firstRow="1" w:lastColumn="0" w:lastRow="0" w:noHBand="0" w:noVBand="1" w:val="04A0"/>
-        <w:tblLayout w:type="fixed"/>
       </w:tblPr>
       <w:tblGrid>
         <w:gridCol w:w="1587"/>
@@ -12553,9 +12544,9 @@
     </w:p>
     <w:p>
       <w:pPr>
+        <w:shd w:val="clear" w:color="auto" w:fill="F2F2F2"/>
         <w:spacing w:line="240" w:lineRule="auto" w:before="80" w:after="200"/>
         <w:ind w:left="340" w:right="227"/>
-        <w:shd w:val="clear" w:color="auto" w:fill="F2F2F2"/>
       </w:pPr>
       <w:r>
         <w:rPr>
@@ -13437,10 +13428,10 @@
           <w:footerReference w:type="default" r:id="rId10"/>
           <w:pgSz w:w="11906" w:h="16838"/>
           <w:pgMar w:top="1701" w:right="1701" w:bottom="1701" w:left="2268" w:header="720" w:footer="720" w:gutter="0"/>
+          <w:pgNumType w:fmt="decimal" w:start="1"/>
           <w:cols w:space="720"/>
           <w:titlePg/>
           <w:docGrid w:linePitch="360"/>
-          <w:pgNumType w:fmt="decimal" w:start="1"/>
         </w:sectPr>
       </w:pPr>
     </w:p>
@@ -13503,7 +13494,6 @@
         <w:jc w:val="center"/>
         <w:tblLayout w:type="fixed"/>
         <w:tblLook w:firstColumn="1" w:firstRow="1" w:lastColumn="0" w:lastRow="0" w:noHBand="0" w:noVBand="1" w:val="04A0"/>
-        <w:tblLayout w:type="fixed"/>
       </w:tblPr>
       <w:tblGrid>
         <w:gridCol w:w="1960"/>
@@ -14139,10 +14129,10 @@
           <w:footerReference w:type="default" r:id="rId19"/>
           <w:pgSz w:w="16838" w:h="11906" w:orient="landscape"/>
           <w:pgMar w:top="1417" w:right="1417" w:bottom="1417" w:left="1701" w:header="720" w:footer="720" w:gutter="0"/>
+          <w:pgNumType w:fmt="decimal" w:start="1"/>
           <w:cols w:space="720"/>
           <w:titlePg/>
           <w:docGrid w:linePitch="360"/>
-          <w:pgNumType w:fmt="decimal" w:start="1"/>
         </w:sectPr>
       </w:pPr>
     </w:p>
@@ -14211,10 +14201,10 @@
           <w:footerReference w:type="default" r:id="rId20"/>
           <w:pgSz w:w="11906" w:h="16838"/>
           <w:pgMar w:top="1701" w:right="1701" w:bottom="1701" w:left="2268" w:header="720" w:footer="720" w:gutter="0"/>
+          <w:pgNumType w:fmt="decimal" w:start="1"/>
           <w:cols w:space="720"/>
           <w:titlePg/>
           <w:docGrid w:linePitch="360"/>
-          <w:pgNumType w:fmt="decimal" w:start="1"/>
         </w:sectPr>
       </w:pPr>
     </w:p>
@@ -14521,10 +14511,10 @@
           <w:footerReference w:type="default" r:id="rId21"/>
           <w:pgSz w:w="11906" w:h="16838"/>
           <w:pgMar w:top="1701" w:right="1701" w:bottom="1701" w:left="2268" w:header="720" w:footer="720" w:gutter="0"/>
+          <w:pgNumType w:fmt="decimal" w:start="1"/>
           <w:cols w:space="720"/>
           <w:titlePg/>
           <w:docGrid w:linePitch="360"/>
-          <w:pgNumType w:fmt="decimal" w:start="1"/>
         </w:sectPr>
       </w:pPr>
     </w:p>
@@ -14557,9 +14547,9 @@
     </w:p>
     <w:p>
       <w:pPr>
+        <w:shd w:val="clear" w:color="auto" w:fill="F2F2F2"/>
         <w:spacing w:line="240" w:lineRule="auto" w:before="80" w:after="200"/>
         <w:ind w:left="340" w:right="227"/>
-        <w:shd w:val="clear" w:color="auto" w:fill="F2F2F2"/>
       </w:pPr>
       <w:r>
         <w:rPr>
@@ -15089,10 +15079,10 @@
       <w:footerReference w:type="default" r:id="rId22"/>
       <w:pgSz w:w="11906" w:h="16838"/>
       <w:pgMar w:top="1701" w:right="1701" w:bottom="1701" w:left="2268" w:header="720" w:footer="720" w:gutter="0"/>
+      <w:pgNumType w:fmt="decimal" w:start="1"/>
       <w:cols w:space="720"/>
       <w:titlePg/>
       <w:docGrid w:linePitch="360"/>
-      <w:pgNumType w:fmt="decimal" w:start="1"/>
     </w:sectPr>
   </w:body>
 </w:document>

</xml_diff>

<commit_message>
Selaraskan urutan komponen Dick and Carey (8 evaluasi formatif, 9 revisi, 10 evaluasi sumatif) pada flowchart dan teks, serta rapikan catatan diagram
Co-authored-by: arena-agent <297053741+arena-agent@users.noreply.github.com>
</commit_message>
<xml_diff>
--- a/laporan/Laporan_UTS_Perbandingan_Model_Desain_Pembelajaran.docx
+++ b/laporan/Laporan_UTS_Perbandingan_Model_Desain_Pembelajaran.docx
@@ -2071,6 +2071,22 @@
           <w:sz w:val="24"/>
         </w:rPr>
         <w:t>Alur ADDIE digambarkan sebagai rangkaian lima tahap yang berurutan, dimulai dari analisis dan berakhir pada evaluasi. Meskipun demikian, gambaran tersebut tidak boleh dipahami sebagai proses satu arah yang kaku. Pada kenyataannya, hasil evaluasi dapat mengembalikan proses ke tahap sebelumnya, misalnya kembali ke desain ketika ditemukan bahwa tujuan tidak selaras dengan instrumen penilaian, atau kembali ke pengembangan ketika ditemukan kesalahan teknis pada media. Branch (2009) menekankan bahwa sifat berulang (iteratif) inilah yang membuat ADDIE tetap relevan, karena setiap tahap dapat diperbaiki sebelum produk digunakan secara luas.</w:t>
+      </w:r>
+    </w:p>
+    <w:p>
+      <w:pPr>
+        <w:spacing w:line="360" w:lineRule="auto" w:after="120"/>
+        <w:ind w:firstLine="720"/>
+        <w:jc w:val="both"/>
+      </w:pPr>
+      <w:r>
+        <w:rPr>
+          <w:rFonts w:ascii="Times New Roman" w:hAnsi="Times New Roman" w:cs="Times New Roman" w:eastAsia="Times New Roman"/>
+          <w:b w:val="0"/>
+          <w:i w:val="0"/>
+          <w:sz w:val="24"/>
+        </w:rPr>
+        <w:t>Umpan balik dari tahap evaluasi tidak hanya berhenti pada laporan akhir. Jika hasil evaluasi menunjukkan bahwa tujuan pembelajaran belum tercapai karena rumusannya kurang operasional, perbaikan diarahkan kembali ke tahap desain. Jika persoalannya terletak pada mutu bahan atau media, perbaikan diarahkan ke tahap pengembangan. Bahkan pada kasus tertentu, temuan di lapangan dapat mengubah kesimpulan awal mengenai kebutuhan, sehingga perbaikan harus dimulai dari tahap analisis. Karena itu, alur ADDIE lebih tepat dibaca sebagai siklus yang dapat berputar kembali, bukan sebagai garis lurus yang berakhir di evaluasi (Branch, 2009; Tegeh &amp; Kirna, 2013).</w:t>
       </w:r>
     </w:p>
     <w:p>
@@ -3656,7 +3672,7 @@
           <w:i w:val="0"/>
           <w:sz w:val="24"/>
         </w:rPr>
-        <w:t>Secara ringkas, alur model Dick and Carey dapat digambarkan sebagai berikut. Komponen 2 dan 3, 4 dan 5, serta 6 dan 7 dapat dikerjakan secara paralel, sedangkan hasil komponen 8 mengalir ke komponen 9 untuk merevisi komponen 4, 6, dan 7. Komponen 10 berada di luar siklus utama karena dilaksanakan setelah produk selesai dan digunakan. Gambar 2.2 menampilkan alur tersebut secara lengkap.</w:t>
+        <w:t>Secara ringkas, alur model Dick and Carey dapat digambarkan sebagai berikut. Komponen 2 dan 3, 4 dan 5, serta 6 dan 7 dapat dikerjakan secara paralel, sedangkan hasil komponen 8 (evaluasi formatif) mengalir ke komponen 9 (revisi) untuk memperbaiki komponen 4, 6, dan 7. Setelah produk hasil revisi digunakan dalam pembelajaran, barulah komponen 10 (evaluasi sumatif) dilaksanakan untuk menilai efektivitas produk secara keseluruhan. Dengan demikian, komponen 10 berada di luar siklus revisi. Alasan penyusunan seperti ini adalah bahwa evaluasi sumatif baru bermakna apabila produk yang dinilai sudah melewati perbaikan berdasarkan evaluasi formatif (Dick et al., 2015). Gambar 2.2 menampilkan alur tersebut secara lengkap.</w:t>
       </w:r>
     </w:p>
     <w:p>
@@ -3667,7 +3683,7 @@
       <w:r>
         <w:drawing>
           <wp:inline xmlns:a="http://schemas.openxmlformats.org/drawingml/2006/main" xmlns:pic="http://schemas.openxmlformats.org/drawingml/2006/picture">
-            <wp:extent cx="5040000" cy="4533866"/>
+            <wp:extent cx="5040000" cy="4835717"/>
             <wp:docPr id="2" name="Picture 2"/>
             <wp:cNvGraphicFramePr>
               <a:graphicFrameLocks noChangeAspect="1"/>
@@ -3688,7 +3704,7 @@
                   <pic:spPr>
                     <a:xfrm>
                       <a:off x="0" y="0"/>
-                      <a:ext cx="5040000" cy="4533866"/>
+                      <a:ext cx="5040000" cy="4835717"/>
                     </a:xfrm>
                     <a:prstGeom prst="rect"/>
                   </pic:spPr>

</xml_diff>